<commit_message>
Completed - 5.JWT-Handson in Spring REST using Spring Boot 3
</commit_message>
<xml_diff>
--- a/Week 3/Spring REST using Spring Boot 3/spring-learn/4. spring-rest-handson output images.docx
+++ b/Week 3/Spring REST using Spring Boot 3/spring-learn/4. spring-rest-handson output images.docx
@@ -82,6 +82,213 @@
                     <a:ln>
                       <a:noFill/>
                     </a:ln>
+                  </pic:spPr>
+                </pic:pic>
+              </a:graphicData>
+            </a:graphic>
+          </wp:inline>
+        </w:drawing>
+      </w:r>
+    </w:p>
+    <w:p/>
+    <w:p>
+      <w:r>
+        <w:rPr>
+          <w:rFonts w:ascii="Arial" w:eastAsia="Times New Roman" w:hAnsi="Arial" w:cs="Arial"/>
+          <w:b/>
+          <w:bCs/>
+          <w:color w:val="333333"/>
+          <w:sz w:val="36"/>
+          <w:szCs w:val="36"/>
+          <w:shd w:val="clear" w:color="auto" w:fill="FFFFFF"/>
+        </w:rPr>
+        <w:t>V</w:t>
+      </w:r>
+      <w:r>
+        <w:rPr>
+          <w:rFonts w:ascii="Arial" w:eastAsia="Times New Roman" w:hAnsi="Arial" w:cs="Arial"/>
+          <w:b/>
+          <w:bCs/>
+          <w:color w:val="333333"/>
+          <w:sz w:val="36"/>
+          <w:szCs w:val="36"/>
+          <w:shd w:val="clear" w:color="auto" w:fill="FFFFFF"/>
+        </w:rPr>
+        <w:t>alidating country code</w:t>
+      </w:r>
+      <w:r>
+        <w:rPr>
+          <w:rFonts w:ascii="Arial" w:eastAsia="Times New Roman" w:hAnsi="Arial" w:cs="Arial"/>
+          <w:color w:val="333333"/>
+          <w:sz w:val="21"/>
+          <w:szCs w:val="21"/>
+          <w:shd w:val="clear" w:color="auto" w:fill="FFFFFF"/>
+        </w:rPr>
+        <w:t> </w:t>
+      </w:r>
+    </w:p>
+    <w:p>
+      <w:r>
+        <w:rPr>
+          <w:noProof/>
+        </w:rPr>
+        <w:drawing>
+          <wp:inline distT="0" distB="0" distL="0" distR="0" wp14:anchorId="207179B6" wp14:editId="75328870">
+            <wp:extent cx="5731510" cy="3199765"/>
+            <wp:effectExtent l="0" t="0" r="2540" b="635"/>
+            <wp:docPr id="13307934" name="Picture 1"/>
+            <wp:cNvGraphicFramePr>
+              <a:graphicFrameLocks xmlns:a="http://schemas.openxmlformats.org/drawingml/2006/main" noChangeAspect="1"/>
+            </wp:cNvGraphicFramePr>
+            <a:graphic xmlns:a="http://schemas.openxmlformats.org/drawingml/2006/main">
+              <a:graphicData uri="http://schemas.openxmlformats.org/drawingml/2006/picture">
+                <pic:pic xmlns:pic="http://schemas.openxmlformats.org/drawingml/2006/picture">
+                  <pic:nvPicPr>
+                    <pic:cNvPr id="13307934" name=""/>
+                    <pic:cNvPicPr/>
+                  </pic:nvPicPr>
+                  <pic:blipFill>
+                    <a:blip r:embed="rId5"/>
+                    <a:stretch>
+                      <a:fillRect/>
+                    </a:stretch>
+                  </pic:blipFill>
+                  <pic:spPr>
+                    <a:xfrm>
+                      <a:off x="0" y="0"/>
+                      <a:ext cx="5731510" cy="3199765"/>
+                    </a:xfrm>
+                    <a:prstGeom prst="rect">
+                      <a:avLst/>
+                    </a:prstGeom>
+                  </pic:spPr>
+                </pic:pic>
+              </a:graphicData>
+            </a:graphic>
+          </wp:inline>
+        </w:drawing>
+      </w:r>
+    </w:p>
+    <w:p>
+      <w:r>
+        <w:rPr>
+          <w:noProof/>
+        </w:rPr>
+        <w:lastRenderedPageBreak/>
+        <w:drawing>
+          <wp:inline distT="0" distB="0" distL="0" distR="0" wp14:anchorId="435C92F2" wp14:editId="24BA196E">
+            <wp:extent cx="5731510" cy="3025140"/>
+            <wp:effectExtent l="0" t="0" r="2540" b="3810"/>
+            <wp:docPr id="389018588" name="Picture 1"/>
+            <wp:cNvGraphicFramePr>
+              <a:graphicFrameLocks xmlns:a="http://schemas.openxmlformats.org/drawingml/2006/main" noChangeAspect="1"/>
+            </wp:cNvGraphicFramePr>
+            <a:graphic xmlns:a="http://schemas.openxmlformats.org/drawingml/2006/main">
+              <a:graphicData uri="http://schemas.openxmlformats.org/drawingml/2006/picture">
+                <pic:pic xmlns:pic="http://schemas.openxmlformats.org/drawingml/2006/picture">
+                  <pic:nvPicPr>
+                    <pic:cNvPr id="389018588" name=""/>
+                    <pic:cNvPicPr/>
+                  </pic:nvPicPr>
+                  <pic:blipFill>
+                    <a:blip r:embed="rId6"/>
+                    <a:stretch>
+                      <a:fillRect/>
+                    </a:stretch>
+                  </pic:blipFill>
+                  <pic:spPr>
+                    <a:xfrm>
+                      <a:off x="0" y="0"/>
+                      <a:ext cx="5731510" cy="3025140"/>
+                    </a:xfrm>
+                    <a:prstGeom prst="rect">
+                      <a:avLst/>
+                    </a:prstGeom>
+                  </pic:spPr>
+                </pic:pic>
+              </a:graphicData>
+            </a:graphic>
+          </wp:inline>
+        </w:drawing>
+      </w:r>
+    </w:p>
+    <w:p>
+      <w:r>
+        <w:rPr>
+          <w:noProof/>
+        </w:rPr>
+        <w:drawing>
+          <wp:inline distT="0" distB="0" distL="0" distR="0" wp14:anchorId="40F8A1DA" wp14:editId="480AED5B">
+            <wp:extent cx="5731510" cy="3217545"/>
+            <wp:effectExtent l="0" t="0" r="2540" b="1905"/>
+            <wp:docPr id="769762816" name="Picture 1"/>
+            <wp:cNvGraphicFramePr>
+              <a:graphicFrameLocks xmlns:a="http://schemas.openxmlformats.org/drawingml/2006/main" noChangeAspect="1"/>
+            </wp:cNvGraphicFramePr>
+            <a:graphic xmlns:a="http://schemas.openxmlformats.org/drawingml/2006/main">
+              <a:graphicData uri="http://schemas.openxmlformats.org/drawingml/2006/picture">
+                <pic:pic xmlns:pic="http://schemas.openxmlformats.org/drawingml/2006/picture">
+                  <pic:nvPicPr>
+                    <pic:cNvPr id="769762816" name=""/>
+                    <pic:cNvPicPr/>
+                  </pic:nvPicPr>
+                  <pic:blipFill>
+                    <a:blip r:embed="rId7"/>
+                    <a:stretch>
+                      <a:fillRect/>
+                    </a:stretch>
+                  </pic:blipFill>
+                  <pic:spPr>
+                    <a:xfrm>
+                      <a:off x="0" y="0"/>
+                      <a:ext cx="5731510" cy="3217545"/>
+                    </a:xfrm>
+                    <a:prstGeom prst="rect">
+                      <a:avLst/>
+                    </a:prstGeom>
+                  </pic:spPr>
+                </pic:pic>
+              </a:graphicData>
+            </a:graphic>
+          </wp:inline>
+        </w:drawing>
+      </w:r>
+    </w:p>
+    <w:p>
+      <w:r>
+        <w:rPr>
+          <w:noProof/>
+        </w:rPr>
+        <w:lastRenderedPageBreak/>
+        <w:drawing>
+          <wp:inline distT="0" distB="0" distL="0" distR="0" wp14:anchorId="71D23882" wp14:editId="02BC73B8">
+            <wp:extent cx="5731510" cy="3409315"/>
+            <wp:effectExtent l="0" t="0" r="2540" b="635"/>
+            <wp:docPr id="1187643516" name="Picture 1"/>
+            <wp:cNvGraphicFramePr>
+              <a:graphicFrameLocks xmlns:a="http://schemas.openxmlformats.org/drawingml/2006/main" noChangeAspect="1"/>
+            </wp:cNvGraphicFramePr>
+            <a:graphic xmlns:a="http://schemas.openxmlformats.org/drawingml/2006/main">
+              <a:graphicData uri="http://schemas.openxmlformats.org/drawingml/2006/picture">
+                <pic:pic xmlns:pic="http://schemas.openxmlformats.org/drawingml/2006/picture">
+                  <pic:nvPicPr>
+                    <pic:cNvPr id="1187643516" name=""/>
+                    <pic:cNvPicPr/>
+                  </pic:nvPicPr>
+                  <pic:blipFill>
+                    <a:blip r:embed="rId8"/>
+                    <a:stretch>
+                      <a:fillRect/>
+                    </a:stretch>
+                  </pic:blipFill>
+                  <pic:spPr>
+                    <a:xfrm>
+                      <a:off x="0" y="0"/>
+                      <a:ext cx="5731510" cy="3409315"/>
+                    </a:xfrm>
+                    <a:prstGeom prst="rect">
+                      <a:avLst/>
+                    </a:prstGeom>
                   </pic:spPr>
                 </pic:pic>
               </a:graphicData>
@@ -704,7 +911,6 @@
   <w:style w:type="character" w:default="1" w:styleId="DefaultParagraphFont">
     <w:name w:val="Default Paragraph Font"/>
     <w:uiPriority w:val="1"/>
-    <w:semiHidden/>
     <w:unhideWhenUsed/>
   </w:style>
   <w:style w:type="table" w:default="1" w:styleId="TableNormal">

</xml_diff>